<commit_message>
Takım en çok 5 kişi, 10 dakikalık gösterim yerleri, depo şablondan (fork yok), paylaşılan takım listesi; çıktılar yeniden üretildi
</commit_message>
<xml_diff>
--- a/docs/prerequisites/cen429-on-gereksinimler-ders-notu.en.docx
+++ b/docs/prerequisites/cen429-on-gereksinimler-ders-notu.en.docx
@@ -485,7 +485,13 @@
               <w:t xml:space="preserve"> </w:t>
             </w:r>
             <w:r>
-              <w:t xml:space="preserve">forking a template, building it, producing its tests and documentation</w:t>
+              <w:t xml:space="preserve">creating a private repository from a template (</w:t>
+            </w:r>
+            <w:r>
+              <w:t xml:space="preserve">“Use this template”</w:t>
+            </w:r>
+            <w:r>
+              <w:t xml:space="preserve">, not fork), building it, producing its tests and documentation</w:t>
             </w:r>
           </w:p>
         </w:tc>
@@ -1584,7 +1590,13 @@
         <w:pStyle w:val="FirstParagraph"/>
       </w:pPr>
       <w:r>
-        <w:t xml:space="preserve">Then fork the project template to your own account, build it and run its tests:</w:t>
+        <w:t xml:space="preserve">Then create your own private repository from the project template (</w:t>
+      </w:r>
+      <w:r>
+        <w:t xml:space="preserve">“Use this template → Create a new repository → Private”</w:t>
+      </w:r>
+      <w:r>
+        <w:t xml:space="preserve">, not fork), build it and run its tests:</w:t>
       </w:r>
     </w:p>
     <w:p>

</xml_diff>